<commit_message>
Expand meeting business plan (revenue + risk sections, cover) and add PDF + bilingual slide deck
docx: added 수익 구조·지속가능성 and 리스크·대응 sections + cover 작성/제출·수신 lines. New docs/VSP-사업계획서-미팅.pdf (6p) and docs/VSP-사업계획-슬라이드.pptx (12 slides, VI/KO), both bilingual, mirroring the plan for the MCST meeting.

Co-Authored-By: Claude Opus 4.8 <noreply@anthropic.com>
</commit_message>
<xml_diff>
--- a/docs/VSP-사업계획서-미팅.docx
+++ b/docs/VSP-사업계획서-미팅.docx
@@ -94,6 +94,7 @@
     </w:p>
     <w:p>
       <w:pPr>
+        <w:spacing w:after="200"/>
         <w:jc w:val="center"/>
       </w:pPr>
       <w:r>
@@ -103,6 +104,33 @@
           <w:szCs w:val="18"/>
         </w:rPr>
         <w:t xml:space="preserve">2026-09  ·  v1.0</w:t>
+      </w:r>
+    </w:p>
+    <w:p>
+      <w:pPr>
+        <w:spacing w:after="8"/>
+        <w:jc w:val="center"/>
+      </w:pPr>
+      <w:r>
+        <w:rPr>
+          <w:color w:val="6A7C8A"/>
+          <w:sz w:val="18"/>
+          <w:szCs w:val="18"/>
+        </w:rPr>
+        <w:t xml:space="preserve">Đơn vị lập · 작성/제출:  ______________________</w:t>
+      </w:r>
+    </w:p>
+    <w:p>
+      <w:pPr>
+        <w:jc w:val="center"/>
+      </w:pPr>
+      <w:r>
+        <w:rPr>
+          <w:color w:val="6A7C8A"/>
+          <w:sz w:val="18"/>
+          <w:szCs w:val="18"/>
+        </w:rPr>
+        <w:t xml:space="preserve">Kính gửi · 수신:  Bộ VHTTDL / Cục TDTT (MCST)</w:t>
       </w:r>
     </w:p>
     <w:p>
@@ -3386,6 +3414,258 @@
           <w:szCs w:val="20"/>
         </w:rPr>
         <w:t xml:space="preserve">  /  초기 도입 범위(파일럿 종목·지역)?</w:t>
+      </w:r>
+    </w:p>
+    <w:p>
+      <w:pPr>
+        <w:pStyle w:val="Heading1"/>
+        <w:spacing w:after="110" w:before="300"/>
+      </w:pPr>
+      <w:r>
+        <w:rPr>
+          <w:b/>
+          <w:bCs/>
+          <w:color w:val="15607A"/>
+          <w:sz w:val="26"/>
+          <w:szCs w:val="26"/>
+        </w:rPr>
+        <w:t xml:space="preserve">Mô hình doanh thu &amp; bền vững</w:t>
+      </w:r>
+      <w:r>
+        <w:rPr>
+          <w:b/>
+          <w:bCs/>
+          <w:color w:val="6A7C8A"/>
+          <w:sz w:val="22"/>
+          <w:szCs w:val="22"/>
+        </w:rPr>
+        <w:t xml:space="preserve">  ·  수익 구조·지속가능성</w:t>
+      </w:r>
+    </w:p>
+    <w:p>
+      <w:pPr>
+        <w:pStyle w:val="ListParagraph"/>
+        <w:numPr>
+          <w:ilvl w:val="0"/>
+          <w:numId w:val="2"/>
+        </w:numPr>
+        <w:spacing w:after="46" w:line="270"/>
+      </w:pPr>
+      <w:r>
+        <w:rPr>
+          <w:sz w:val="20"/>
+          <w:szCs w:val="20"/>
+        </w:rPr>
+        <w:t xml:space="preserve">Phí sử dụng hệ thống theo tổ chức/cơ quan</w:t>
+      </w:r>
+      <w:r>
+        <w:rPr>
+          <w:color w:val="4A5A66"/>
+          <w:sz w:val="20"/>
+          <w:szCs w:val="20"/>
+        </w:rPr>
+        <w:t xml:space="preserve">  /  기관별 시스템 이용료</w:t>
+      </w:r>
+    </w:p>
+    <w:p>
+      <w:pPr>
+        <w:pStyle w:val="ListParagraph"/>
+        <w:numPr>
+          <w:ilvl w:val="0"/>
+          <w:numId w:val="2"/>
+        </w:numPr>
+        <w:spacing w:after="46" w:line="270"/>
+      </w:pPr>
+      <w:r>
+        <w:rPr>
+          <w:sz w:val="20"/>
+          <w:szCs w:val="20"/>
+        </w:rPr>
+        <w:t xml:space="preserve">Gian quảng cáo &amp; hiển thị tài trợ (chia sẻ doanh thu với liên đoàn môn)</w:t>
+      </w:r>
+      <w:r>
+        <w:rPr>
+          <w:color w:val="4A5A66"/>
+          <w:sz w:val="20"/>
+          <w:szCs w:val="20"/>
+        </w:rPr>
+        <w:t xml:space="preserve">  /  광고 지면·후원 노출(종목 협회와 수익 배분)</w:t>
+      </w:r>
+    </w:p>
+    <w:p>
+      <w:pPr>
+        <w:pStyle w:val="ListParagraph"/>
+        <w:numPr>
+          <w:ilvl w:val="0"/>
+          <w:numId w:val="2"/>
+        </w:numPr>
+        <w:spacing w:after="46" w:line="270"/>
+      </w:pPr>
+      <w:r>
+        <w:rPr>
+          <w:sz w:val="20"/>
+          <w:szCs w:val="20"/>
+        </w:rPr>
+        <w:t xml:space="preserve">Dịch vụ giá trị gia tăng: chứng nhận, thống kê, dữ liệu mở theo hợp đồng</w:t>
+      </w:r>
+      <w:r>
+        <w:rPr>
+          <w:color w:val="4A5A66"/>
+          <w:sz w:val="20"/>
+          <w:szCs w:val="20"/>
+        </w:rPr>
+        <w:t xml:space="preserve">  /  부가 서비스: 증명·통계·계약 기반 데이터</w:t>
+      </w:r>
+    </w:p>
+    <w:p>
+      <w:pPr>
+        <w:pStyle w:val="ListParagraph"/>
+        <w:numPr>
+          <w:ilvl w:val="0"/>
+          <w:numId w:val="2"/>
+        </w:numPr>
+        <w:spacing w:after="46" w:line="270"/>
+      </w:pPr>
+      <w:r>
+        <w:rPr>
+          <w:sz w:val="20"/>
+          <w:szCs w:val="20"/>
+        </w:rPr>
+        <w:t xml:space="preserve">Nền tảng KHÔNG trung gian dòng tiền (không thu hộ) — tuân thủ NĐ 52/2024</w:t>
+      </w:r>
+      <w:r>
+        <w:rPr>
+          <w:color w:val="4A5A66"/>
+          <w:sz w:val="20"/>
+          <w:szCs w:val="20"/>
+        </w:rPr>
+        <w:t xml:space="preserve">  /  자금 미경유(수납 대행 아님) — 시행령 52/2024 준수</w:t>
+      </w:r>
+    </w:p>
+    <w:p>
+      <w:pPr>
+        <w:pStyle w:val="Heading1"/>
+        <w:spacing w:after="110" w:before="300"/>
+      </w:pPr>
+      <w:r>
+        <w:rPr>
+          <w:b/>
+          <w:bCs/>
+          <w:color w:val="15607A"/>
+          <w:sz w:val="26"/>
+          <w:szCs w:val="26"/>
+        </w:rPr>
+        <w:t xml:space="preserve">Rủi ro &amp; ứng phó</w:t>
+      </w:r>
+      <w:r>
+        <w:rPr>
+          <w:b/>
+          <w:bCs/>
+          <w:color w:val="6A7C8A"/>
+          <w:sz w:val="22"/>
+          <w:szCs w:val="22"/>
+        </w:rPr>
+        <w:t xml:space="preserve">  ·  리스크·대응</w:t>
+      </w:r>
+    </w:p>
+    <w:p>
+      <w:pPr>
+        <w:pStyle w:val="ListParagraph"/>
+        <w:numPr>
+          <w:ilvl w:val="0"/>
+          <w:numId w:val="2"/>
+        </w:numPr>
+        <w:spacing w:after="46" w:line="270"/>
+      </w:pPr>
+      <w:r>
+        <w:rPr>
+          <w:sz w:val="20"/>
+          <w:szCs w:val="20"/>
+        </w:rPr>
+        <w:t xml:space="preserve">Chậm nhận biểu mẫu chính thức (nút thắt lớn nhất) → đề nghị ngay tại họp, chuẩn bị song song</w:t>
+      </w:r>
+      <w:r>
+        <w:rPr>
+          <w:color w:val="4A5A66"/>
+          <w:sz w:val="20"/>
+          <w:szCs w:val="20"/>
+        </w:rPr>
+        <w:t xml:space="preserve">  /  공식 서식 수령 지연(최대 병목) → 미팅서 즉시 요청·병렬 준비</w:t>
+      </w:r>
+    </w:p>
+    <w:p>
+      <w:pPr>
+        <w:pStyle w:val="ListParagraph"/>
+        <w:numPr>
+          <w:ilvl w:val="0"/>
+          <w:numId w:val="2"/>
+        </w:numPr>
+        <w:spacing w:after="46" w:line="270"/>
+      </w:pPr>
+      <w:r>
+        <w:rPr>
+          <w:sz w:val="20"/>
+          <w:szCs w:val="20"/>
+        </w:rPr>
+        <w:t xml:space="preserve">Pháp lý: chữ ký điện tử·giấy phép thanh toán → cổng rà soát pháp lý trước pilot</w:t>
+      </w:r>
+      <w:r>
+        <w:rPr>
+          <w:color w:val="4A5A66"/>
+          <w:sz w:val="20"/>
+          <w:szCs w:val="20"/>
+        </w:rPr>
+        <w:t xml:space="preserve">  /  법률: 전자서명·결제 라이선스 → 파일럿 전 법률검토 게이트</w:t>
+      </w:r>
+    </w:p>
+    <w:p>
+      <w:pPr>
+        <w:pStyle w:val="ListParagraph"/>
+        <w:numPr>
+          <w:ilvl w:val="0"/>
+          <w:numId w:val="2"/>
+        </w:numPr>
+        <w:spacing w:after="46" w:line="270"/>
+      </w:pPr>
+      <w:r>
+        <w:rPr>
+          <w:sz w:val="20"/>
+          <w:szCs w:val="20"/>
+        </w:rPr>
+        <w:t xml:space="preserve">Nội địa hóa dữ liệu → đặt CSDL·tệp·sao lưu tại vùng Việt Nam</w:t>
+      </w:r>
+      <w:r>
+        <w:rPr>
+          <w:color w:val="4A5A66"/>
+          <w:sz w:val="20"/>
+          <w:szCs w:val="20"/>
+        </w:rPr>
+        <w:t xml:space="preserve">  /  데이터 현지화 → DB·첨부·백업 베트남 리전 배치</w:t>
+      </w:r>
+    </w:p>
+    <w:p>
+      <w:pPr>
+        <w:pStyle w:val="ListParagraph"/>
+        <w:numPr>
+          <w:ilvl w:val="0"/>
+          <w:numId w:val="2"/>
+        </w:numPr>
+        <w:spacing w:after="46" w:line="270"/>
+      </w:pPr>
+      <w:r>
+        <w:rPr>
+          <w:sz w:val="20"/>
+          <w:szCs w:val="20"/>
+        </w:rPr>
+        <w:t xml:space="preserve">Rủi ro chấp nhận vận hành → kiểm chứng bằng pilot 1 môn · 1 địa phương</w:t>
+      </w:r>
+      <w:r>
+        <w:rPr>
+          <w:color w:val="4A5A66"/>
+          <w:sz w:val="20"/>
+          <w:szCs w:val="20"/>
+        </w:rPr>
+        <w:t xml:space="preserve">  /  운영 채택 리스크 → 1종목·1지역 파일럿으로 검증</w:t>
       </w:r>
     </w:p>
     <w:p>

</xml_diff>